<commit_message>
Resume: fixture dates shifted by a fixed offset, and a fictional school (TEC-31 item 8)
All three fixtures kept a real month-year employment timeline, and one school
name matched a real college. In word/document.xml only, every month-year is
shifted by one fixed offset (ranges keep their order and lengths), and the
school is renamed to an unmistakably fictional one. Every other part of each
archive is byte-identical to before, entry dates included, and the tag
structure of document.xml is unchanged — both verified by script before
writing.

Tests and comments that reused the same timeline are shifted by the same
offset; that is the fixture data changing, not an assertion loosening. The
byte-identity tests (styles, numbering, theme) pass unchanged.

Co-Authored-By: Claude Opus 5.5 (1M context) <noreply@anthropic.com>
Claude-Session: https://claude.ai/code/session_01GCVvmJbTYt6KeLZ6crxxAa
</commit_message>
<xml_diff>
--- a/apps/resume/tests/fixtures/jobright-sample.docx
+++ b/apps/resume/tests/fixtures/jobright-sample.docx
@@ -6464,7 +6464,7 @@
           <w:b w:val="true"/>
           <w:i w:val="false"/>
         </w:rPr>
-        <w:t xml:space="preserve">Northwind Athletics Jan 2026 - Present</w:t>
+        <w:t xml:space="preserve">Northwind Athletics Nov 2022 - Present</w:t>
       </w:r>
       <w:r>
         <w:rPr>
@@ -17964,7 +17964,7 @@
           <w:b w:val="true"/>
           <w:i w:val="false"/>
         </w:rPr>
-        <w:t xml:space="preserve">Beacon Nonprofit Group Oct 2024 - Jan 2026</w:t>
+        <w:t xml:space="preserve">Beacon Nonprofit Group Aug 2021 - Nov 2022</w:t>
       </w:r>
       <w:r>
         <w:rPr>
@@ -24369,7 +24369,7 @@
           <w:b w:val="true"/>
           <w:i w:val="false"/>
         </w:rPr>
-        <w:t xml:space="preserve">Halbrook Advisory Jan 2024 - Oct 2024</w:t>
+        <w:t xml:space="preserve">Halbrook Advisory Nov 2020 - Aug 2021</w:t>
       </w:r>
       <w:r>
         <w:rPr>
@@ -28489,7 +28489,7 @@
           <w:b w:val="true"/>
           <w:i w:val="false"/>
         </w:rPr>
-        <w:t xml:space="preserve">Cardinal Engineering May 2022 - Feb 2024</w:t>
+        <w:t xml:space="preserve">Cardinal Engineering Mar 2019 - Dec 2020</w:t>
       </w:r>
       <w:r>
         <w:rPr>
@@ -32605,7 +32605,7 @@
           <w:b w:val="true"/>
           <w:i w:val="false"/>
         </w:rPr>
-        <w:t xml:space="preserve">Trellis Construction Group Sep 2017 - Apr 2022</w:t>
+        <w:t xml:space="preserve">Trellis Construction Group Jul 2014 - Feb 2019</w:t>
       </w:r>
       <w:r>
         <w:rPr>
@@ -40233,7 +40233,7 @@
           <w:b w:val="true"/>
           <w:i w:val="false"/>
         </w:rPr>
-        <w:t xml:space="preserve">Riverside Community CollegeDec 2009</w:t>
+        <w:t xml:space="preserve">Fernhollow Fixture CollegeOct 2006</w:t>
       </w:r>
       <w:r>
         <w:rPr>
@@ -40535,7 +40535,7 @@
                           <w:b w:val="true"/>
                           <w:i w:val="false"/>
                         </w:rPr>
-                        <w:t xml:space="preserve">Dec 2009</w:t>
+                        <w:t xml:space="preserve">Oct 2006</w:t>
                       </w:r>
                       <w:r>
                         <w:rPr>
@@ -40925,7 +40925,7 @@
           <w:b w:val="false"/>
           <w:i w:val="false"/>
         </w:rPr>
-        <w:t xml:space="preserve">Platform Certified Administrator: Mar 2024</w:t>
+        <w:t xml:space="preserve">Platform Certified Administrator: Jan 2021</w:t>
       </w:r>
       <w:r>
         <w:rPr>
@@ -41208,7 +41208,7 @@
           <w:b w:val="false"/>
           <w:i w:val="false"/>
         </w:rPr>
-        <w:t xml:space="preserve">Platform Certified Business Analyst: Dec 2024</w:t>
+        <w:t xml:space="preserve">Platform Certified Business Analyst: Oct 2021</w:t>
       </w:r>
       <w:r>
         <w:rPr>

</xml_diff>